<commit_message>
L avis a l Adria encara no ha sortit
El correu s havia escrit donant per fet que l avis de no carregar dades de test
ja li havia arribat per separat, i no es aixi. Es torna a posar sencer i com a
avis, no com a constancia: que apunta a la SAP de proves, que les taules es
refrescaran cada nit, i que la contrasenya d analitza_ro va canviar el 31/08 i
el simptoma sembla un problema de xarxa.

La finestra de risc es real i es d avui: des del 16/09 dbo.est_* es refresca
cada nit amb dades de DB_FARINERA_TEST, quan abans es quedava congelat al run
91 del 24/08 perque el job avortava. L Adria te acces per VPN des del 10/09 i
ningu li ha dit res, o sigui que pot ingerir dades de proves a la seva Analitza
de produccio i donar d alta clients que no existeixen.

Co-Authored-By: Claude Opus 5 (1M context) <noreply@anthropic.com>
</commit_message>
<xml_diff>
--- a/resposta_adria_3.docx
+++ b/resposta_adria_3.docx
@@ -43,7 +43,7 @@
           <w:b w:val="0"/>
           <w:i w:val="0"/>
         </w:rPr>
-        <w:t>La connexió: el que ja t'he dit avui, per escrit</w:t>
+        <w:t>La connexió ja està oberta — i dues coses abans que la facis servir</w:t>
       </w:r>
     </w:p>
     <w:p>
@@ -52,7 +52,7 @@
           <w:b w:val="0"/>
           <w:i w:val="0"/>
         </w:rPr>
-        <w:t xml:space="preserve">Per no repetir-m'hi, però perquè quedi al correu: Sistemes us van habilitar l'accés el </w:t>
+        <w:t xml:space="preserve">Sistemes us van habilitar l'accés el </w:t>
       </w:r>
       <w:r>
         <w:rPr>
@@ -66,7 +66,7 @@
           <w:b w:val="0"/>
           <w:i w:val="0"/>
         </w:rPr>
-        <w:t xml:space="preserve">, entreu per VPN com fèieu amb KAIS, i d'allà a </w:t>
+        <w:t xml:space="preserve">. Entreu per VPN, igual que fèieu amb KAIS, i d'allà a </w:t>
       </w:r>
       <w:r>
         <w:rPr>
@@ -100,7 +100,7 @@
           <w:b w:val="0"/>
           <w:i w:val="0"/>
         </w:rPr>
-        <w:t>. Credencials de VPN i URL, les de sempre.</w:t>
+        <w:t>. Les credencials de la VPN i l'URL són les que ja teniu: aquí no ha canviat res.</w:t>
       </w:r>
     </w:p>
     <w:p>
@@ -109,24 +109,91 @@
           <w:b w:val="0"/>
           <w:i w:val="0"/>
         </w:rPr>
-        <w:t>Les dues coses que t'he avançat avui:</w:t>
+        <w:t xml:space="preserve">⚠️ </w:t>
       </w:r>
-    </w:p>
-    <w:p>
-      <w:pPr>
-        <w:pStyle w:val="ListBullet"/>
-      </w:pPr>
       <w:r>
         <w:rPr>
           <w:b/>
           <w:i w:val="0"/>
         </w:rPr>
-        <w:t>La contrasenya d'</w:t>
+        <w:t>No carreguis res cap a producció encara.</w:t>
+      </w:r>
+      <w:r>
+        <w:rPr>
+          <w:b w:val="0"/>
+          <w:i w:val="0"/>
+        </w:rPr>
+        <w:t xml:space="preserve"> Això apunta a la nostra SAP de </w:t>
+      </w:r>
+      <w:r>
+        <w:rPr>
+          <w:b/>
+          <w:i w:val="0"/>
+        </w:rPr>
+        <w:t>proves</w:t>
+      </w:r>
+      <w:r>
+        <w:rPr>
+          <w:b w:val="0"/>
+          <w:i w:val="0"/>
+        </w:rPr>
+        <w:t xml:space="preserve">, i a partir d'aquesta setmana les taules es refresquen cada nit: hi veuràs dades que semblen bones i no ho són. Són de l'entorn de test i et durien clients i imports que no existeixen — i amb codis que no són tots els de KAIS, o sigui que te'ls ingeriria com a </w:t>
+      </w:r>
+      <w:r>
+        <w:rPr>
+          <w:b/>
+          <w:i w:val="0"/>
+        </w:rPr>
+        <w:t>clients nous</w:t>
+      </w:r>
+      <w:r>
+        <w:rPr>
+          <w:b w:val="0"/>
+          <w:i w:val="0"/>
+        </w:rPr>
+        <w:t xml:space="preserve">. Per validar la connexió i el format, tot el que vulguis. El pas a la companyia real el faig jo el </w:t>
+      </w:r>
+      <w:r>
+        <w:rPr>
+          <w:b/>
+          <w:i w:val="0"/>
+        </w:rPr>
+        <w:t>2 de novembre</w:t>
+      </w:r>
+      <w:r>
+        <w:rPr>
+          <w:b w:val="0"/>
+          <w:i w:val="0"/>
+        </w:rPr>
+        <w:t xml:space="preserve"> i t'aviso el mateix dia.</w:t>
+      </w:r>
+    </w:p>
+    <w:p>
+      <w:r>
+        <w:rPr>
+          <w:b w:val="0"/>
+          <w:i w:val="0"/>
+        </w:rPr>
+        <w:t xml:space="preserve">⚠️ </w:t>
+      </w:r>
+      <w:r>
+        <w:rPr>
+          <w:b/>
+          <w:i w:val="0"/>
+        </w:rPr>
+        <w:t>I el compte de SQL ha canviat.</w:t>
+      </w:r>
+      <w:r>
+        <w:rPr>
+          <w:b w:val="0"/>
+          <w:i w:val="0"/>
+        </w:rPr>
+        <w:t xml:space="preserve"> El 31 d'agost vaig rotar la contrasenya d'</w:t>
       </w:r>
       <w:r>
         <w:rPr>
           <w:rFonts w:ascii="Consolas" w:hAnsi="Consolas"/>
-          <w:b/>
+          <w:b w:val="0"/>
           <w:i w:val="0"/>
           <w:color w:val="333333"/>
           <w:sz w:val="20"/>
@@ -135,17 +202,10 @@
       </w:r>
       <w:r>
         <w:rPr>
-          <w:b/>
-          <w:i w:val="0"/>
-        </w:rPr>
-        <w:t xml:space="preserve"> va canviar el 31 d'agost</w:t>
-      </w:r>
-      <w:r>
-        <w:rPr>
           <w:b w:val="0"/>
           <w:i w:val="0"/>
         </w:rPr>
-        <w:t xml:space="preserve"> i els permisos es van acotar el mateix dia (ara és </w:t>
+        <w:t xml:space="preserve"> i vaig acotar-li els permisos: ara és </w:t>
       </w:r>
       <w:r>
         <w:rPr>
@@ -179,47 +239,35 @@
           <w:b w:val="0"/>
           <w:i w:val="0"/>
         </w:rPr>
-        <w:t xml:space="preserve">). La que tinguessis guardada no et funcionarà, i el símptoma sembla un problema de xarxa. </w:t>
+        <w:t xml:space="preserve"> (abans veia més coses de les que li tocaven). Si ho proves amb la que tenies guardada, el que veuràs és un error de login que </w:t>
       </w:r>
       <w:r>
         <w:rPr>
           <w:b/>
           <w:i w:val="0"/>
         </w:rPr>
-        <w:t>Te la passo per un canal a part.</w:t>
-      </w:r>
-    </w:p>
-    <w:p>
-      <w:pPr>
-        <w:pStyle w:val="ListBullet"/>
-      </w:pPr>
-      <w:r>
-        <w:rPr>
-          <w:b/>
-          <w:i w:val="0"/>
-        </w:rPr>
-        <w:t>No carreguis res a producció encara.</w:t>
+        <w:t>sembla un problema de xarxa</w:t>
       </w:r>
       <w:r>
         <w:rPr>
           <w:b w:val="0"/>
           <w:i w:val="0"/>
         </w:rPr>
-        <w:t xml:space="preserve"> Això apunta a la nostra SAP de </w:t>
+        <w:t xml:space="preserve">, i el diagnòstic se'n va cap a Sistemes durant dies. La contrasenya nova </w:t>
       </w:r>
       <w:r>
         <w:rPr>
           <w:b/>
           <w:i w:val="0"/>
         </w:rPr>
-        <w:t>proves</w:t>
+        <w:t>te la passo per un canal a part</w:t>
       </w:r>
       <w:r>
         <w:rPr>
           <w:b w:val="0"/>
           <w:i w:val="0"/>
         </w:rPr>
-        <w:t>, i des d'aquesta nit les taules es refresquen cada dia: hi veuràs dades que semblen bones i no ho són. Per validar connexió i format, tot el que vulguis. El pas a la companyia real el faig el 2 de novembre i t'aviso el mateix dia.</w:t>
+        <w:t>, no per correu.</w:t>
       </w:r>
     </w:p>
     <w:p>

</xml_diff>